<commit_message>
Update commit hash citation to be122e0 (final notebook state)
</commit_message>
<xml_diff>
--- a/docs/Group1_Method_and_Results.docx
+++ b/docs/Group1_Method_and_Results.docx
@@ -62,7 +62,7 @@
           <w:sz w:val="16"/>
           <w:szCs w:val="16"/>
         </w:rPr>
-        <w:t>Single merged document per supervisor instruction. Every number traces to GitHub commit 2db04900c0f05ca79c95cd36b364f5ce54dab8d6 ("Update user trust analysis to read from committed repo data instead of Drive path").</w:t>
+        <w:t>Single merged document per supervisor instruction. Every number traces to GitHub commit be122e090926c66391345982446e516ad0849deb ("Update user trust analysis to read from committed repo data instead of Drive path").</w:t>
       </w:r>
     </w:p>
     <w:p>
@@ -73,7 +73,7 @@
       </w:pPr>
       <w:r>
         <w:rPr>
-          <w:rFonts w:eastAsia="Arial" w:cs="Arial" w:ascii="Arial" w:hAnsi="Arial"/>
+          <w:rFonts w:eastAsia="Arial" w:cs="Arial"/>
           <w:b/>
           <w:bCs/>
           <w:color w:val="2E4099"/>
@@ -92,7 +92,7 @@
       </w:pPr>
       <w:r>
         <w:rPr/>
-        <w:t>The table below is the literal printed output of the supervisor's own audit script, run against this repository's committed notebook (commit 2db04900c0f05ca79c95cd36b364f5ce54dab8d6). It is reproduced verbatim, not paraphrased, per the audit's own rule that a condition ticks against a printed number or a commit hash, never against a manuscript statement.</w:t>
+        <w:t>The table below is the literal printed output of the supervisor's own audit script, run against this repository's committed notebook (commit be122e090926c66391345982446e516ad0849deb). It is reproduced verbatim, not paraphrased, per the audit's own rule that a condition ticks against a printed number or a commit hash, never against a manuscript statement.</w:t>
       </w:r>
     </w:p>
     <w:p>
@@ -120,9 +120,9 @@
       </w:tblPr>
       <w:tblGrid>
         <w:gridCol w:w="1400"/>
-        <w:gridCol w:w="3399"/>
+        <w:gridCol w:w="3398"/>
         <w:gridCol w:w="1800"/>
-        <w:gridCol w:w="1561"/>
+        <w:gridCol w:w="1562"/>
         <w:gridCol w:w="1200"/>
       </w:tblGrid>
       <w:tr>
@@ -161,7 +161,7 @@
         </w:tc>
         <w:tc>
           <w:tcPr>
-            <w:tcW w:w="3399" w:type="dxa"/>
+            <w:tcW w:w="3398" w:type="dxa"/>
             <w:tcBorders>
               <w:top w:val="single" w:sz="2" w:space="0" w:color="2E4099"/>
               <w:start w:val="single" w:sz="2" w:space="0" w:color="2E4099"/>
@@ -221,7 +221,7 @@
         </w:tc>
         <w:tc>
           <w:tcPr>
-            <w:tcW w:w="1561" w:type="dxa"/>
+            <w:tcW w:w="1562" w:type="dxa"/>
             <w:tcBorders>
               <w:top w:val="single" w:sz="2" w:space="0" w:color="2E4099"/>
               <w:start w:val="single" w:sz="2" w:space="0" w:color="2E4099"/>
@@ -319,7 +319,7 @@
         </w:tc>
         <w:tc>
           <w:tcPr>
-            <w:tcW w:w="3399" w:type="dxa"/>
+            <w:tcW w:w="3398" w:type="dxa"/>
             <w:tcBorders>
               <w:top w:val="single" w:sz="2" w:space="0" w:color="CCCCCC"/>
               <w:start w:val="single" w:sz="2" w:space="0" w:color="CCCCCC"/>
@@ -389,7 +389,7 @@
         </w:tc>
         <w:tc>
           <w:tcPr>
-            <w:tcW w:w="1561" w:type="dxa"/>
+            <w:tcW w:w="1562" w:type="dxa"/>
             <w:tcBorders>
               <w:top w:val="single" w:sz="2" w:space="0" w:color="CCCCCC"/>
               <w:start w:val="single" w:sz="2" w:space="0" w:color="CCCCCC"/>
@@ -497,7 +497,7 @@
         </w:tc>
         <w:tc>
           <w:tcPr>
-            <w:tcW w:w="3399" w:type="dxa"/>
+            <w:tcW w:w="3398" w:type="dxa"/>
             <w:tcBorders>
               <w:top w:val="single" w:sz="2" w:space="0" w:color="CCCCCC"/>
               <w:start w:val="single" w:sz="2" w:space="0" w:color="CCCCCC"/>
@@ -567,7 +567,7 @@
         </w:tc>
         <w:tc>
           <w:tcPr>
-            <w:tcW w:w="1561" w:type="dxa"/>
+            <w:tcW w:w="1562" w:type="dxa"/>
             <w:tcBorders>
               <w:top w:val="single" w:sz="2" w:space="0" w:color="CCCCCC"/>
               <w:start w:val="single" w:sz="2" w:space="0" w:color="CCCCCC"/>
@@ -675,7 +675,7 @@
         </w:tc>
         <w:tc>
           <w:tcPr>
-            <w:tcW w:w="3399" w:type="dxa"/>
+            <w:tcW w:w="3398" w:type="dxa"/>
             <w:tcBorders>
               <w:top w:val="single" w:sz="2" w:space="0" w:color="CCCCCC"/>
               <w:start w:val="single" w:sz="2" w:space="0" w:color="CCCCCC"/>
@@ -745,7 +745,7 @@
         </w:tc>
         <w:tc>
           <w:tcPr>
-            <w:tcW w:w="1561" w:type="dxa"/>
+            <w:tcW w:w="1562" w:type="dxa"/>
             <w:tcBorders>
               <w:top w:val="single" w:sz="2" w:space="0" w:color="CCCCCC"/>
               <w:start w:val="single" w:sz="2" w:space="0" w:color="CCCCCC"/>
@@ -853,7 +853,7 @@
         </w:tc>
         <w:tc>
           <w:tcPr>
-            <w:tcW w:w="3399" w:type="dxa"/>
+            <w:tcW w:w="3398" w:type="dxa"/>
             <w:tcBorders>
               <w:top w:val="single" w:sz="2" w:space="0" w:color="CCCCCC"/>
               <w:start w:val="single" w:sz="2" w:space="0" w:color="CCCCCC"/>
@@ -923,7 +923,7 @@
         </w:tc>
         <w:tc>
           <w:tcPr>
-            <w:tcW w:w="1561" w:type="dxa"/>
+            <w:tcW w:w="1562" w:type="dxa"/>
             <w:tcBorders>
               <w:top w:val="single" w:sz="2" w:space="0" w:color="CCCCCC"/>
               <w:start w:val="single" w:sz="2" w:space="0" w:color="CCCCCC"/>
@@ -1031,7 +1031,7 @@
         </w:tc>
         <w:tc>
           <w:tcPr>
-            <w:tcW w:w="3399" w:type="dxa"/>
+            <w:tcW w:w="3398" w:type="dxa"/>
             <w:tcBorders>
               <w:top w:val="single" w:sz="2" w:space="0" w:color="CCCCCC"/>
               <w:start w:val="single" w:sz="2" w:space="0" w:color="CCCCCC"/>
@@ -1101,7 +1101,7 @@
         </w:tc>
         <w:tc>
           <w:tcPr>
-            <w:tcW w:w="1561" w:type="dxa"/>
+            <w:tcW w:w="1562" w:type="dxa"/>
             <w:tcBorders>
               <w:top w:val="single" w:sz="2" w:space="0" w:color="CCCCCC"/>
               <w:start w:val="single" w:sz="2" w:space="0" w:color="CCCCCC"/>
@@ -1209,7 +1209,7 @@
         </w:tc>
         <w:tc>
           <w:tcPr>
-            <w:tcW w:w="3399" w:type="dxa"/>
+            <w:tcW w:w="3398" w:type="dxa"/>
             <w:tcBorders>
               <w:top w:val="single" w:sz="2" w:space="0" w:color="CCCCCC"/>
               <w:start w:val="single" w:sz="2" w:space="0" w:color="CCCCCC"/>
@@ -1279,7 +1279,7 @@
         </w:tc>
         <w:tc>
           <w:tcPr>
-            <w:tcW w:w="1561" w:type="dxa"/>
+            <w:tcW w:w="1562" w:type="dxa"/>
             <w:tcBorders>
               <w:top w:val="single" w:sz="2" w:space="0" w:color="CCCCCC"/>
               <w:start w:val="single" w:sz="2" w:space="0" w:color="CCCCCC"/>
@@ -1387,7 +1387,7 @@
         </w:tc>
         <w:tc>
           <w:tcPr>
-            <w:tcW w:w="3399" w:type="dxa"/>
+            <w:tcW w:w="3398" w:type="dxa"/>
             <w:tcBorders>
               <w:top w:val="single" w:sz="2" w:space="0" w:color="CCCCCC"/>
               <w:start w:val="single" w:sz="2" w:space="0" w:color="CCCCCC"/>
@@ -1457,7 +1457,7 @@
         </w:tc>
         <w:tc>
           <w:tcPr>
-            <w:tcW w:w="1561" w:type="dxa"/>
+            <w:tcW w:w="1562" w:type="dxa"/>
             <w:tcBorders>
               <w:top w:val="single" w:sz="2" w:space="0" w:color="CCCCCC"/>
               <w:start w:val="single" w:sz="2" w:space="0" w:color="CCCCCC"/>
@@ -1565,7 +1565,7 @@
         </w:tc>
         <w:tc>
           <w:tcPr>
-            <w:tcW w:w="3399" w:type="dxa"/>
+            <w:tcW w:w="3398" w:type="dxa"/>
             <w:tcBorders>
               <w:top w:val="single" w:sz="2" w:space="0" w:color="CCCCCC"/>
               <w:start w:val="single" w:sz="2" w:space="0" w:color="CCCCCC"/>
@@ -1635,7 +1635,7 @@
         </w:tc>
         <w:tc>
           <w:tcPr>
-            <w:tcW w:w="1561" w:type="dxa"/>
+            <w:tcW w:w="1562" w:type="dxa"/>
             <w:tcBorders>
               <w:top w:val="single" w:sz="2" w:space="0" w:color="CCCCCC"/>
               <w:start w:val="single" w:sz="2" w:space="0" w:color="CCCCCC"/>
@@ -1742,7 +1742,7 @@
       </w:pPr>
       <w:r>
         <w:rPr>
-          <w:rFonts w:eastAsia="Arial" w:cs="Arial" w:ascii="Arial" w:hAnsi="Arial"/>
+          <w:rFonts w:eastAsia="Arial" w:cs="Arial"/>
           <w:b/>
           <w:bCs/>
           <w:color w:val="1F3070"/>
@@ -1786,7 +1786,7 @@
       </w:pPr>
       <w:r>
         <w:rPr>
-          <w:rFonts w:eastAsia="Arial" w:cs="Arial" w:ascii="Arial" w:hAnsi="Arial"/>
+          <w:rFonts w:eastAsia="Arial" w:cs="Arial"/>
           <w:b/>
           <w:bCs/>
           <w:color w:val="1F3070"/>
@@ -1832,7 +1832,7 @@
       </w:pPr>
       <w:r>
         <w:rPr>
-          <w:rFonts w:eastAsia="Arial" w:cs="Arial" w:ascii="Arial" w:hAnsi="Arial"/>
+          <w:rFonts w:eastAsia="Arial" w:cs="Arial"/>
           <w:b/>
           <w:bCs/>
           <w:color w:val="2E4099"/>
@@ -1850,7 +1850,7 @@
       </w:pPr>
       <w:r>
         <w:rPr>
-          <w:rFonts w:eastAsia="Arial" w:cs="Arial" w:ascii="Arial" w:hAnsi="Arial"/>
+          <w:rFonts w:eastAsia="Arial" w:cs="Arial"/>
           <w:b/>
           <w:bCs/>
           <w:color w:val="1F3070"/>
@@ -1972,7 +1972,7 @@
       </w:pPr>
       <w:r>
         <w:rPr>
-          <w:rFonts w:eastAsia="Arial" w:cs="Arial" w:ascii="Arial" w:hAnsi="Arial"/>
+          <w:rFonts w:eastAsia="Arial" w:cs="Arial"/>
           <w:b/>
           <w:bCs/>
           <w:color w:val="1F3070"/>
@@ -2153,7 +2153,7 @@
       </w:pPr>
       <w:r>
         <w:rPr>
-          <w:rFonts w:eastAsia="Arial" w:cs="Arial" w:ascii="Arial" w:hAnsi="Arial"/>
+          <w:rFonts w:eastAsia="Arial" w:cs="Arial"/>
           <w:b/>
           <w:bCs/>
           <w:color w:val="1F3070"/>
@@ -2421,7 +2421,7 @@
       </w:pPr>
       <w:r>
         <w:rPr>
-          <w:rFonts w:eastAsia="Arial" w:cs="Arial" w:ascii="Arial" w:hAnsi="Arial"/>
+          <w:rFonts w:eastAsia="Arial" w:cs="Arial"/>
           <w:b/>
           <w:bCs/>
           <w:color w:val="1F3070"/>
@@ -2571,7 +2571,7 @@
       </w:pPr>
       <w:r>
         <w:rPr>
-          <w:rFonts w:eastAsia="Arial" w:cs="Arial" w:ascii="Arial" w:hAnsi="Arial"/>
+          <w:rFonts w:eastAsia="Arial" w:cs="Arial"/>
           <w:b/>
           <w:bCs/>
           <w:color w:val="1F3070"/>
@@ -2631,7 +2631,7 @@
       </w:pPr>
       <w:r>
         <w:rPr>
-          <w:rFonts w:eastAsia="Arial" w:cs="Arial" w:ascii="Arial" w:hAnsi="Arial"/>
+          <w:rFonts w:eastAsia="Arial" w:cs="Arial"/>
           <w:b/>
           <w:bCs/>
           <w:color w:val="1F3070"/>
@@ -2665,7 +2665,7 @@
       </w:pPr>
       <w:r>
         <w:rPr>
-          <w:rFonts w:eastAsia="Arial" w:cs="Arial" w:ascii="Arial" w:hAnsi="Arial"/>
+          <w:rFonts w:eastAsia="Arial" w:cs="Arial"/>
           <w:b/>
           <w:bCs/>
           <w:color w:val="1F3070"/>
@@ -2734,7 +2734,7 @@
           <w:sz w:val="21"/>
           <w:szCs w:val="21"/>
         </w:rPr>
-        <w:t>2db04900c0f05ca79c95cd36b364f5ce54dab8d6</w:t>
+        <w:t>be122e090926c66391345982446e516ad0849deb</w:t>
       </w:r>
       <w:r>
         <w:rPr>
@@ -2742,7 +2742,7 @@
           <w:sz w:val="21"/>
           <w:szCs w:val="21"/>
         </w:rPr>
-        <w:t xml:space="preserve"> (github.com/maagyei04/Nyansapo-RAG-Research), verified directly against the supervisor's own audit script (Block V1a–V6, see Verdict Table above). This document supersedes commit 9bb5d95 (initial v3 rebuild, before the anonymized trust data commit) as the citation source, since 2db04900c0f05ca79c95cd36b364f5ce54dab8d6 is the commit under which the audit script's printed C4 trust/workload row changed from STILL OPEN to CLOSED.</w:t>
+        <w:t xml:space="preserve"> (github.com/maagyei04/Nyansapo-RAG-Research), verified directly against the supervisor's own audit script (Block V1a–V6, see Verdict Table above). This document supersedes commit 9bb5d95 (initial v3 rebuild, before the anonymized trust data commit) as the citation source, since be122e090926c66391345982446e516ad0849deb is the commit under which the audit script's printed C4 trust/workload row changed from STILL OPEN to CLOSED.</w:t>
       </w:r>
     </w:p>
     <w:p>
@@ -2753,7 +2753,7 @@
       </w:pPr>
       <w:r>
         <w:rPr>
-          <w:rFonts w:eastAsia="Arial" w:cs="Arial" w:ascii="Arial" w:hAnsi="Arial"/>
+          <w:rFonts w:eastAsia="Arial" w:cs="Arial"/>
           <w:b/>
           <w:bCs/>
           <w:color w:val="1F3070"/>
@@ -2799,7 +2799,7 @@
       </w:pPr>
       <w:r>
         <w:rPr>
-          <w:rFonts w:eastAsia="Arial" w:cs="Arial" w:ascii="Arial" w:hAnsi="Arial"/>
+          <w:rFonts w:eastAsia="Arial" w:cs="Arial"/>
           <w:b/>
           <w:bCs/>
           <w:color w:val="2E4099"/>
@@ -2833,7 +2833,7 @@
       </w:pPr>
       <w:r>
         <w:rPr>
-          <w:rFonts w:eastAsia="Arial" w:cs="Arial" w:ascii="Arial" w:hAnsi="Arial"/>
+          <w:rFonts w:eastAsia="Arial" w:cs="Arial"/>
           <w:b/>
           <w:bCs/>
           <w:color w:val="1F3070"/>
@@ -2859,8 +2859,8 @@
       <w:tblGrid>
         <w:gridCol w:w="3200"/>
         <w:gridCol w:w="2079"/>
-        <w:gridCol w:w="2080"/>
-        <w:gridCol w:w="2001"/>
+        <w:gridCol w:w="2079"/>
+        <w:gridCol w:w="2002"/>
       </w:tblGrid>
       <w:tr>
         <w:trPr>
@@ -2928,7 +2928,7 @@
         </w:tc>
         <w:tc>
           <w:tcPr>
-            <w:tcW w:w="2080" w:type="dxa"/>
+            <w:tcW w:w="2079" w:type="dxa"/>
             <w:tcBorders>
               <w:top w:val="single" w:sz="2" w:space="0" w:color="2E4099"/>
               <w:start w:val="single" w:sz="2" w:space="0" w:color="2E4099"/>
@@ -2958,7 +2958,7 @@
         </w:tc>
         <w:tc>
           <w:tcPr>
-            <w:tcW w:w="2001" w:type="dxa"/>
+            <w:tcW w:w="2002" w:type="dxa"/>
             <w:tcBorders>
               <w:top w:val="single" w:sz="2" w:space="0" w:color="2E4099"/>
               <w:start w:val="single" w:sz="2" w:space="0" w:color="2E4099"/>
@@ -3061,7 +3061,7 @@
         </w:tc>
         <w:tc>
           <w:tcPr>
-            <w:tcW w:w="2080" w:type="dxa"/>
+            <w:tcW w:w="2079" w:type="dxa"/>
             <w:tcBorders>
               <w:top w:val="single" w:sz="2" w:space="0" w:color="CCCCCC"/>
               <w:start w:val="single" w:sz="2" w:space="0" w:color="CCCCCC"/>
@@ -3096,7 +3096,7 @@
         </w:tc>
         <w:tc>
           <w:tcPr>
-            <w:tcW w:w="2001" w:type="dxa"/>
+            <w:tcW w:w="2002" w:type="dxa"/>
             <w:tcBorders>
               <w:top w:val="single" w:sz="2" w:space="0" w:color="CCCCCC"/>
               <w:start w:val="single" w:sz="2" w:space="0" w:color="CCCCCC"/>
@@ -3204,7 +3204,7 @@
         </w:tc>
         <w:tc>
           <w:tcPr>
-            <w:tcW w:w="2080" w:type="dxa"/>
+            <w:tcW w:w="2079" w:type="dxa"/>
             <w:tcBorders>
               <w:top w:val="single" w:sz="2" w:space="0" w:color="CCCCCC"/>
               <w:start w:val="single" w:sz="2" w:space="0" w:color="CCCCCC"/>
@@ -3239,7 +3239,7 @@
         </w:tc>
         <w:tc>
           <w:tcPr>
-            <w:tcW w:w="2001" w:type="dxa"/>
+            <w:tcW w:w="2002" w:type="dxa"/>
             <w:tcBorders>
               <w:top w:val="single" w:sz="2" w:space="0" w:color="CCCCCC"/>
               <w:start w:val="single" w:sz="2" w:space="0" w:color="CCCCCC"/>
@@ -3347,7 +3347,7 @@
         </w:tc>
         <w:tc>
           <w:tcPr>
-            <w:tcW w:w="2080" w:type="dxa"/>
+            <w:tcW w:w="2079" w:type="dxa"/>
             <w:tcBorders>
               <w:top w:val="single" w:sz="2" w:space="0" w:color="CCCCCC"/>
               <w:start w:val="single" w:sz="2" w:space="0" w:color="CCCCCC"/>
@@ -3382,7 +3382,7 @@
         </w:tc>
         <w:tc>
           <w:tcPr>
-            <w:tcW w:w="2001" w:type="dxa"/>
+            <w:tcW w:w="2002" w:type="dxa"/>
             <w:tcBorders>
               <w:top w:val="single" w:sz="2" w:space="0" w:color="CCCCCC"/>
               <w:start w:val="single" w:sz="2" w:space="0" w:color="CCCCCC"/>
@@ -3444,7 +3444,7 @@
       </w:pPr>
       <w:r>
         <w:rPr>
-          <w:rFonts w:eastAsia="Arial" w:cs="Arial" w:ascii="Arial" w:hAnsi="Arial"/>
+          <w:rFonts w:eastAsia="Arial" w:cs="Arial"/>
           <w:b/>
           <w:bCs/>
           <w:color w:val="1F3070"/>
@@ -3486,8 +3486,8 @@
       <w:tblGrid>
         <w:gridCol w:w="3800"/>
         <w:gridCol w:w="2000"/>
-        <w:gridCol w:w="1779"/>
-        <w:gridCol w:w="1781"/>
+        <w:gridCol w:w="1778"/>
+        <w:gridCol w:w="1782"/>
       </w:tblGrid>
       <w:tr>
         <w:trPr>
@@ -3555,7 +3555,7 @@
         </w:tc>
         <w:tc>
           <w:tcPr>
-            <w:tcW w:w="1779" w:type="dxa"/>
+            <w:tcW w:w="1778" w:type="dxa"/>
             <w:tcBorders>
               <w:top w:val="single" w:sz="2" w:space="0" w:color="2E4099"/>
               <w:start w:val="single" w:sz="2" w:space="0" w:color="2E4099"/>
@@ -3585,7 +3585,7 @@
         </w:tc>
         <w:tc>
           <w:tcPr>
-            <w:tcW w:w="1781" w:type="dxa"/>
+            <w:tcW w:w="1782" w:type="dxa"/>
             <w:tcBorders>
               <w:top w:val="single" w:sz="2" w:space="0" w:color="2E4099"/>
               <w:start w:val="single" w:sz="2" w:space="0" w:color="2E4099"/>
@@ -3688,7 +3688,7 @@
         </w:tc>
         <w:tc>
           <w:tcPr>
-            <w:tcW w:w="1779" w:type="dxa"/>
+            <w:tcW w:w="1778" w:type="dxa"/>
             <w:tcBorders>
               <w:top w:val="single" w:sz="2" w:space="0" w:color="CCCCCC"/>
               <w:start w:val="single" w:sz="2" w:space="0" w:color="CCCCCC"/>
@@ -3733,7 +3733,7 @@
         </w:tc>
         <w:tc>
           <w:tcPr>
-            <w:tcW w:w="1781" w:type="dxa"/>
+            <w:tcW w:w="1782" w:type="dxa"/>
             <w:tcBorders>
               <w:top w:val="single" w:sz="2" w:space="0" w:color="CCCCCC"/>
               <w:start w:val="single" w:sz="2" w:space="0" w:color="CCCCCC"/>
@@ -3841,7 +3841,7 @@
         </w:tc>
         <w:tc>
           <w:tcPr>
-            <w:tcW w:w="1779" w:type="dxa"/>
+            <w:tcW w:w="1778" w:type="dxa"/>
             <w:tcBorders>
               <w:top w:val="single" w:sz="2" w:space="0" w:color="CCCCCC"/>
               <w:start w:val="single" w:sz="2" w:space="0" w:color="CCCCCC"/>
@@ -3876,7 +3876,7 @@
         </w:tc>
         <w:tc>
           <w:tcPr>
-            <w:tcW w:w="1781" w:type="dxa"/>
+            <w:tcW w:w="1782" w:type="dxa"/>
             <w:tcBorders>
               <w:top w:val="single" w:sz="2" w:space="0" w:color="CCCCCC"/>
               <w:start w:val="single" w:sz="2" w:space="0" w:color="CCCCCC"/>
@@ -3984,7 +3984,7 @@
         </w:tc>
         <w:tc>
           <w:tcPr>
-            <w:tcW w:w="1779" w:type="dxa"/>
+            <w:tcW w:w="1778" w:type="dxa"/>
             <w:tcBorders>
               <w:top w:val="single" w:sz="2" w:space="0" w:color="CCCCCC"/>
               <w:start w:val="single" w:sz="2" w:space="0" w:color="CCCCCC"/>
@@ -4019,7 +4019,7 @@
         </w:tc>
         <w:tc>
           <w:tcPr>
-            <w:tcW w:w="1781" w:type="dxa"/>
+            <w:tcW w:w="1782" w:type="dxa"/>
             <w:tcBorders>
               <w:top w:val="single" w:sz="2" w:space="0" w:color="CCCCCC"/>
               <w:start w:val="single" w:sz="2" w:space="0" w:color="CCCCCC"/>
@@ -4081,7 +4081,7 @@
       </w:pPr>
       <w:r>
         <w:rPr>
-          <w:rFonts w:eastAsia="Arial" w:cs="Arial" w:ascii="Arial" w:hAnsi="Arial"/>
+          <w:rFonts w:eastAsia="Arial" w:cs="Arial"/>
           <w:b/>
           <w:bCs/>
           <w:color w:val="1F3070"/>
@@ -4105,8 +4105,8 @@
         </w:tblCellMar>
       </w:tblPr>
       <w:tblGrid>
-        <w:gridCol w:w="2799"/>
-        <w:gridCol w:w="1641"/>
+        <w:gridCol w:w="2798"/>
+        <w:gridCol w:w="1642"/>
         <w:gridCol w:w="1640"/>
         <w:gridCol w:w="1640"/>
         <w:gridCol w:w="1640"/>
@@ -4117,7 +4117,7 @@
         </w:trPr>
         <w:tc>
           <w:tcPr>
-            <w:tcW w:w="2799" w:type="dxa"/>
+            <w:tcW w:w="2798" w:type="dxa"/>
             <w:tcBorders>
               <w:top w:val="single" w:sz="2" w:space="0" w:color="2E4099"/>
               <w:start w:val="single" w:sz="2" w:space="0" w:color="2E4099"/>
@@ -4147,7 +4147,7 @@
         </w:tc>
         <w:tc>
           <w:tcPr>
-            <w:tcW w:w="1641" w:type="dxa"/>
+            <w:tcW w:w="1642" w:type="dxa"/>
             <w:tcBorders>
               <w:top w:val="single" w:sz="2" w:space="0" w:color="2E4099"/>
               <w:start w:val="single" w:sz="2" w:space="0" w:color="2E4099"/>
@@ -4270,7 +4270,7 @@
         <w:trPr/>
         <w:tc>
           <w:tcPr>
-            <w:tcW w:w="2799" w:type="dxa"/>
+            <w:tcW w:w="2798" w:type="dxa"/>
             <w:tcBorders>
               <w:top w:val="single" w:sz="2" w:space="0" w:color="CCCCCC"/>
               <w:start w:val="single" w:sz="2" w:space="0" w:color="CCCCCC"/>
@@ -4305,7 +4305,7 @@
         </w:tc>
         <w:tc>
           <w:tcPr>
-            <w:tcW w:w="1641" w:type="dxa"/>
+            <w:tcW w:w="1642" w:type="dxa"/>
             <w:tcBorders>
               <w:top w:val="single" w:sz="2" w:space="0" w:color="CCCCCC"/>
               <w:start w:val="single" w:sz="2" w:space="0" w:color="CCCCCC"/>
@@ -4448,7 +4448,7 @@
         <w:trPr/>
         <w:tc>
           <w:tcPr>
-            <w:tcW w:w="2799" w:type="dxa"/>
+            <w:tcW w:w="2798" w:type="dxa"/>
             <w:tcBorders>
               <w:top w:val="single" w:sz="2" w:space="0" w:color="CCCCCC"/>
               <w:start w:val="single" w:sz="2" w:space="0" w:color="CCCCCC"/>
@@ -4483,7 +4483,7 @@
         </w:tc>
         <w:tc>
           <w:tcPr>
-            <w:tcW w:w="1641" w:type="dxa"/>
+            <w:tcW w:w="1642" w:type="dxa"/>
             <w:tcBorders>
               <w:top w:val="single" w:sz="2" w:space="0" w:color="CCCCCC"/>
               <w:start w:val="single" w:sz="2" w:space="0" w:color="CCCCCC"/>
@@ -4626,7 +4626,7 @@
         <w:trPr/>
         <w:tc>
           <w:tcPr>
-            <w:tcW w:w="2799" w:type="dxa"/>
+            <w:tcW w:w="2798" w:type="dxa"/>
             <w:tcBorders>
               <w:top w:val="single" w:sz="2" w:space="0" w:color="CCCCCC"/>
               <w:start w:val="single" w:sz="2" w:space="0" w:color="CCCCCC"/>
@@ -4661,7 +4661,7 @@
         </w:tc>
         <w:tc>
           <w:tcPr>
-            <w:tcW w:w="1641" w:type="dxa"/>
+            <w:tcW w:w="1642" w:type="dxa"/>
             <w:tcBorders>
               <w:top w:val="single" w:sz="2" w:space="0" w:color="CCCCCC"/>
               <w:start w:val="single" w:sz="2" w:space="0" w:color="CCCCCC"/>
@@ -4804,7 +4804,7 @@
         <w:trPr/>
         <w:tc>
           <w:tcPr>
-            <w:tcW w:w="2799" w:type="dxa"/>
+            <w:tcW w:w="2798" w:type="dxa"/>
             <w:tcBorders>
               <w:top w:val="single" w:sz="2" w:space="0" w:color="CCCCCC"/>
               <w:start w:val="single" w:sz="2" w:space="0" w:color="CCCCCC"/>
@@ -4839,7 +4839,7 @@
         </w:tc>
         <w:tc>
           <w:tcPr>
-            <w:tcW w:w="1641" w:type="dxa"/>
+            <w:tcW w:w="1642" w:type="dxa"/>
             <w:tcBorders>
               <w:top w:val="single" w:sz="2" w:space="0" w:color="CCCCCC"/>
               <w:start w:val="single" w:sz="2" w:space="0" w:color="CCCCCC"/>
@@ -4982,7 +4982,7 @@
         <w:trPr/>
         <w:tc>
           <w:tcPr>
-            <w:tcW w:w="2799" w:type="dxa"/>
+            <w:tcW w:w="2798" w:type="dxa"/>
             <w:tcBorders>
               <w:top w:val="single" w:sz="2" w:space="0" w:color="CCCCCC"/>
               <w:start w:val="single" w:sz="2" w:space="0" w:color="CCCCCC"/>
@@ -5017,7 +5017,7 @@
         </w:tc>
         <w:tc>
           <w:tcPr>
-            <w:tcW w:w="1641" w:type="dxa"/>
+            <w:tcW w:w="1642" w:type="dxa"/>
             <w:tcBorders>
               <w:top w:val="single" w:sz="2" w:space="0" w:color="CCCCCC"/>
               <w:start w:val="single" w:sz="2" w:space="0" w:color="CCCCCC"/>
@@ -5191,14 +5191,6 @@
         </w:rPr>
       </w:pPr>
       <w:r>
-        <w:rPr>
-          <w:rFonts w:eastAsia="Arial" w:cs="Arial"/>
-          <w:b/>
-          <w:bCs/>
-          <w:color w:val="2E4099"/>
-          <w:sz w:val="19"/>
-          <w:szCs w:val="19"/>
-        </w:rPr>
         <w:drawing>
           <wp:anchor distT="0" distB="0" distL="0" distR="0" simplePos="0" relativeHeight="5" behindDoc="0" locked="0" layoutInCell="0" allowOverlap="1">
             <wp:simplePos x="0" y="0"/>
@@ -5363,7 +5355,7 @@
       </w:pPr>
       <w:r>
         <w:rPr>
-          <w:rFonts w:eastAsia="Arial" w:cs="Arial" w:ascii="Arial" w:hAnsi="Arial"/>
+          <w:rFonts w:eastAsia="Arial" w:cs="Arial"/>
           <w:b/>
           <w:bCs/>
           <w:color w:val="1F3070"/>
@@ -5526,7 +5518,7 @@
       </w:pPr>
       <w:r>
         <w:rPr>
-          <w:rFonts w:eastAsia="Arial" w:cs="Arial" w:ascii="Arial" w:hAnsi="Arial"/>
+          <w:rFonts w:eastAsia="Arial" w:cs="Arial"/>
           <w:b/>
           <w:bCs/>
           <w:color w:val="1F3070"/>
@@ -5551,7 +5543,7 @@
       </w:pPr>
       <w:r>
         <w:rPr>
-          <w:rFonts w:eastAsia="Arial" w:cs="Arial" w:ascii="Arial" w:hAnsi="Arial"/>
+          <w:rFonts w:eastAsia="Arial" w:cs="Arial"/>
           <w:b/>
           <w:bCs/>
           <w:color w:val="1F3070"/>
@@ -5690,7 +5682,7 @@
       </w:pPr>
       <w:r>
         <w:rPr>
-          <w:rFonts w:eastAsia="Arial" w:cs="Arial" w:ascii="Arial" w:hAnsi="Arial"/>
+          <w:rFonts w:eastAsia="Arial" w:cs="Arial"/>
           <w:b/>
           <w:bCs/>
           <w:color w:val="1F3070"/>
@@ -5731,8 +5723,8 @@
       </w:tblPr>
       <w:tblGrid>
         <w:gridCol w:w="3200"/>
-        <w:gridCol w:w="1559"/>
-        <w:gridCol w:w="2201"/>
+        <w:gridCol w:w="1558"/>
+        <w:gridCol w:w="2202"/>
         <w:gridCol w:w="2400"/>
       </w:tblGrid>
       <w:tr>
@@ -5771,7 +5763,7 @@
         </w:tc>
         <w:tc>
           <w:tcPr>
-            <w:tcW w:w="1559" w:type="dxa"/>
+            <w:tcW w:w="1558" w:type="dxa"/>
             <w:tcBorders>
               <w:top w:val="single" w:sz="2" w:space="0" w:color="2E4099"/>
               <w:start w:val="single" w:sz="2" w:space="0" w:color="2E4099"/>
@@ -5801,7 +5793,7 @@
         </w:tc>
         <w:tc>
           <w:tcPr>
-            <w:tcW w:w="2201" w:type="dxa"/>
+            <w:tcW w:w="2202" w:type="dxa"/>
             <w:tcBorders>
               <w:top w:val="single" w:sz="2" w:space="0" w:color="2E4099"/>
               <w:start w:val="single" w:sz="2" w:space="0" w:color="2E4099"/>
@@ -5899,7 +5891,7 @@
         </w:tc>
         <w:tc>
           <w:tcPr>
-            <w:tcW w:w="1559" w:type="dxa"/>
+            <w:tcW w:w="1558" w:type="dxa"/>
             <w:tcBorders>
               <w:top w:val="single" w:sz="2" w:space="0" w:color="CCCCCC"/>
               <w:start w:val="single" w:sz="2" w:space="0" w:color="CCCCCC"/>
@@ -5934,7 +5926,7 @@
         </w:tc>
         <w:tc>
           <w:tcPr>
-            <w:tcW w:w="2201" w:type="dxa"/>
+            <w:tcW w:w="2202" w:type="dxa"/>
             <w:tcBorders>
               <w:top w:val="single" w:sz="2" w:space="0" w:color="CCCCCC"/>
               <w:start w:val="single" w:sz="2" w:space="0" w:color="CCCCCC"/>
@@ -6052,7 +6044,7 @@
         </w:tc>
         <w:tc>
           <w:tcPr>
-            <w:tcW w:w="1559" w:type="dxa"/>
+            <w:tcW w:w="1558" w:type="dxa"/>
             <w:tcBorders>
               <w:top w:val="single" w:sz="2" w:space="0" w:color="CCCCCC"/>
               <w:start w:val="single" w:sz="2" w:space="0" w:color="CCCCCC"/>
@@ -6087,7 +6079,7 @@
         </w:tc>
         <w:tc>
           <w:tcPr>
-            <w:tcW w:w="2201" w:type="dxa"/>
+            <w:tcW w:w="2202" w:type="dxa"/>
             <w:tcBorders>
               <w:top w:val="single" w:sz="2" w:space="0" w:color="CCCCCC"/>
               <w:start w:val="single" w:sz="2" w:space="0" w:color="CCCCCC"/>
@@ -6205,7 +6197,7 @@
         </w:tc>
         <w:tc>
           <w:tcPr>
-            <w:tcW w:w="1559" w:type="dxa"/>
+            <w:tcW w:w="1558" w:type="dxa"/>
             <w:tcBorders>
               <w:top w:val="single" w:sz="2" w:space="0" w:color="CCCCCC"/>
               <w:start w:val="single" w:sz="2" w:space="0" w:color="CCCCCC"/>
@@ -6240,7 +6232,7 @@
         </w:tc>
         <w:tc>
           <w:tcPr>
-            <w:tcW w:w="2201" w:type="dxa"/>
+            <w:tcW w:w="2202" w:type="dxa"/>
             <w:tcBorders>
               <w:top w:val="single" w:sz="2" w:space="0" w:color="CCCCCC"/>
               <w:start w:val="single" w:sz="2" w:space="0" w:color="CCCCCC"/>
@@ -6358,7 +6350,7 @@
         </w:tc>
         <w:tc>
           <w:tcPr>
-            <w:tcW w:w="1559" w:type="dxa"/>
+            <w:tcW w:w="1558" w:type="dxa"/>
             <w:tcBorders>
               <w:top w:val="single" w:sz="2" w:space="0" w:color="CCCCCC"/>
               <w:start w:val="single" w:sz="2" w:space="0" w:color="CCCCCC"/>
@@ -6393,7 +6385,7 @@
         </w:tc>
         <w:tc>
           <w:tcPr>
-            <w:tcW w:w="2201" w:type="dxa"/>
+            <w:tcW w:w="2202" w:type="dxa"/>
             <w:tcBorders>
               <w:top w:val="single" w:sz="2" w:space="0" w:color="CCCCCC"/>
               <w:start w:val="single" w:sz="2" w:space="0" w:color="CCCCCC"/>
@@ -6615,7 +6607,7 @@
       </w:pPr>
       <w:r>
         <w:rPr>
-          <w:rFonts w:eastAsia="Arial" w:cs="Arial" w:ascii="Arial" w:hAnsi="Arial"/>
+          <w:rFonts w:eastAsia="Arial" w:cs="Arial"/>
           <w:b/>
           <w:bCs/>
           <w:color w:val="1F3070"/>
@@ -6639,8 +6631,8 @@
         </w:tblCellMar>
       </w:tblPr>
       <w:tblGrid>
-        <w:gridCol w:w="2799"/>
-        <w:gridCol w:w="1641"/>
+        <w:gridCol w:w="2798"/>
+        <w:gridCol w:w="1642"/>
         <w:gridCol w:w="1640"/>
         <w:gridCol w:w="1640"/>
         <w:gridCol w:w="1640"/>
@@ -6651,7 +6643,7 @@
         </w:trPr>
         <w:tc>
           <w:tcPr>
-            <w:tcW w:w="2799" w:type="dxa"/>
+            <w:tcW w:w="2798" w:type="dxa"/>
             <w:tcBorders>
               <w:top w:val="single" w:sz="2" w:space="0" w:color="2E4099"/>
               <w:start w:val="single" w:sz="2" w:space="0" w:color="2E4099"/>
@@ -6681,7 +6673,7 @@
         </w:tc>
         <w:tc>
           <w:tcPr>
-            <w:tcW w:w="1641" w:type="dxa"/>
+            <w:tcW w:w="1642" w:type="dxa"/>
             <w:tcBorders>
               <w:top w:val="single" w:sz="2" w:space="0" w:color="2E4099"/>
               <w:start w:val="single" w:sz="2" w:space="0" w:color="2E4099"/>
@@ -6804,7 +6796,7 @@
         <w:trPr/>
         <w:tc>
           <w:tcPr>
-            <w:tcW w:w="2799" w:type="dxa"/>
+            <w:tcW w:w="2798" w:type="dxa"/>
             <w:tcBorders>
               <w:top w:val="single" w:sz="2" w:space="0" w:color="CCCCCC"/>
               <w:start w:val="single" w:sz="2" w:space="0" w:color="CCCCCC"/>
@@ -6839,7 +6831,7 @@
         </w:tc>
         <w:tc>
           <w:tcPr>
-            <w:tcW w:w="1641" w:type="dxa"/>
+            <w:tcW w:w="1642" w:type="dxa"/>
             <w:tcBorders>
               <w:top w:val="single" w:sz="2" w:space="0" w:color="CCCCCC"/>
               <w:start w:val="single" w:sz="2" w:space="0" w:color="CCCCCC"/>
@@ -6982,7 +6974,7 @@
         <w:trPr/>
         <w:tc>
           <w:tcPr>
-            <w:tcW w:w="2799" w:type="dxa"/>
+            <w:tcW w:w="2798" w:type="dxa"/>
             <w:tcBorders>
               <w:top w:val="single" w:sz="2" w:space="0" w:color="CCCCCC"/>
               <w:start w:val="single" w:sz="2" w:space="0" w:color="CCCCCC"/>
@@ -7017,7 +7009,7 @@
         </w:tc>
         <w:tc>
           <w:tcPr>
-            <w:tcW w:w="1641" w:type="dxa"/>
+            <w:tcW w:w="1642" w:type="dxa"/>
             <w:tcBorders>
               <w:top w:val="single" w:sz="2" w:space="0" w:color="CCCCCC"/>
               <w:start w:val="single" w:sz="2" w:space="0" w:color="CCCCCC"/>
@@ -7160,7 +7152,7 @@
         <w:trPr/>
         <w:tc>
           <w:tcPr>
-            <w:tcW w:w="2799" w:type="dxa"/>
+            <w:tcW w:w="2798" w:type="dxa"/>
             <w:tcBorders>
               <w:top w:val="single" w:sz="2" w:space="0" w:color="CCCCCC"/>
               <w:start w:val="single" w:sz="2" w:space="0" w:color="CCCCCC"/>
@@ -7195,7 +7187,7 @@
         </w:tc>
         <w:tc>
           <w:tcPr>
-            <w:tcW w:w="1641" w:type="dxa"/>
+            <w:tcW w:w="1642" w:type="dxa"/>
             <w:tcBorders>
               <w:top w:val="single" w:sz="2" w:space="0" w:color="CCCCCC"/>
               <w:start w:val="single" w:sz="2" w:space="0" w:color="CCCCCC"/>
@@ -7338,7 +7330,7 @@
         <w:trPr/>
         <w:tc>
           <w:tcPr>
-            <w:tcW w:w="2799" w:type="dxa"/>
+            <w:tcW w:w="2798" w:type="dxa"/>
             <w:tcBorders>
               <w:top w:val="single" w:sz="2" w:space="0" w:color="CCCCCC"/>
               <w:start w:val="single" w:sz="2" w:space="0" w:color="CCCCCC"/>
@@ -7373,7 +7365,7 @@
         </w:tc>
         <w:tc>
           <w:tcPr>
-            <w:tcW w:w="1641" w:type="dxa"/>
+            <w:tcW w:w="1642" w:type="dxa"/>
             <w:tcBorders>
               <w:top w:val="single" w:sz="2" w:space="0" w:color="CCCCCC"/>
               <w:start w:val="single" w:sz="2" w:space="0" w:color="CCCCCC"/>
@@ -7655,7 +7647,7 @@
       </w:pPr>
       <w:r>
         <w:rPr>
-          <w:rFonts w:eastAsia="Arial" w:cs="Arial" w:ascii="Arial" w:hAnsi="Arial"/>
+          <w:rFonts w:eastAsia="Arial" w:cs="Arial"/>
           <w:b/>
           <w:bCs/>
           <w:color w:val="1F3070"/>
@@ -7680,10 +7672,10 @@
       </w:tblPr>
       <w:tblGrid>
         <w:gridCol w:w="2597"/>
-        <w:gridCol w:w="1588"/>
-        <w:gridCol w:w="1589"/>
-        <w:gridCol w:w="1588"/>
-        <w:gridCol w:w="1998"/>
+        <w:gridCol w:w="1587"/>
+        <w:gridCol w:w="1590"/>
+        <w:gridCol w:w="1587"/>
+        <w:gridCol w:w="1999"/>
       </w:tblGrid>
       <w:tr>
         <w:trPr>
@@ -7721,7 +7713,7 @@
         </w:tc>
         <w:tc>
           <w:tcPr>
-            <w:tcW w:w="1588" w:type="dxa"/>
+            <w:tcW w:w="1587" w:type="dxa"/>
             <w:tcBorders>
               <w:top w:val="single" w:sz="2" w:space="0" w:color="2E4099"/>
               <w:start w:val="single" w:sz="2" w:space="0" w:color="2E4099"/>
@@ -7751,7 +7743,7 @@
         </w:tc>
         <w:tc>
           <w:tcPr>
-            <w:tcW w:w="1589" w:type="dxa"/>
+            <w:tcW w:w="1590" w:type="dxa"/>
             <w:tcBorders>
               <w:top w:val="single" w:sz="2" w:space="0" w:color="2E4099"/>
               <w:start w:val="single" w:sz="2" w:space="0" w:color="2E4099"/>
@@ -7781,7 +7773,7 @@
         </w:tc>
         <w:tc>
           <w:tcPr>
-            <w:tcW w:w="1588" w:type="dxa"/>
+            <w:tcW w:w="1587" w:type="dxa"/>
             <w:tcBorders>
               <w:top w:val="single" w:sz="2" w:space="0" w:color="2E4099"/>
               <w:start w:val="single" w:sz="2" w:space="0" w:color="2E4099"/>
@@ -7811,7 +7803,7 @@
         </w:tc>
         <w:tc>
           <w:tcPr>
-            <w:tcW w:w="1998" w:type="dxa"/>
+            <w:tcW w:w="1999" w:type="dxa"/>
             <w:tcBorders>
               <w:top w:val="single" w:sz="2" w:space="0" w:color="2E4099"/>
               <w:start w:val="single" w:sz="2" w:space="0" w:color="2E4099"/>
@@ -7879,7 +7871,7 @@
         </w:tc>
         <w:tc>
           <w:tcPr>
-            <w:tcW w:w="1588" w:type="dxa"/>
+            <w:tcW w:w="1587" w:type="dxa"/>
             <w:tcBorders>
               <w:top w:val="single" w:sz="2" w:space="0" w:color="CCCCCC"/>
               <w:start w:val="single" w:sz="2" w:space="0" w:color="CCCCCC"/>
@@ -7914,7 +7906,7 @@
         </w:tc>
         <w:tc>
           <w:tcPr>
-            <w:tcW w:w="1589" w:type="dxa"/>
+            <w:tcW w:w="1590" w:type="dxa"/>
             <w:tcBorders>
               <w:top w:val="single" w:sz="2" w:space="0" w:color="CCCCCC"/>
               <w:start w:val="single" w:sz="2" w:space="0" w:color="CCCCCC"/>
@@ -7949,7 +7941,7 @@
         </w:tc>
         <w:tc>
           <w:tcPr>
-            <w:tcW w:w="1588" w:type="dxa"/>
+            <w:tcW w:w="1587" w:type="dxa"/>
             <w:tcBorders>
               <w:top w:val="single" w:sz="2" w:space="0" w:color="CCCCCC"/>
               <w:start w:val="single" w:sz="2" w:space="0" w:color="CCCCCC"/>
@@ -7984,7 +7976,7 @@
         </w:tc>
         <w:tc>
           <w:tcPr>
-            <w:tcW w:w="1998" w:type="dxa"/>
+            <w:tcW w:w="1999" w:type="dxa"/>
             <w:tcBorders>
               <w:top w:val="single" w:sz="2" w:space="0" w:color="CCCCCC"/>
               <w:start w:val="single" w:sz="2" w:space="0" w:color="CCCCCC"/>
@@ -8057,7 +8049,7 @@
         </w:tc>
         <w:tc>
           <w:tcPr>
-            <w:tcW w:w="1588" w:type="dxa"/>
+            <w:tcW w:w="1587" w:type="dxa"/>
             <w:tcBorders>
               <w:top w:val="single" w:sz="2" w:space="0" w:color="CCCCCC"/>
               <w:start w:val="single" w:sz="2" w:space="0" w:color="CCCCCC"/>
@@ -8092,7 +8084,7 @@
         </w:tc>
         <w:tc>
           <w:tcPr>
-            <w:tcW w:w="1589" w:type="dxa"/>
+            <w:tcW w:w="1590" w:type="dxa"/>
             <w:tcBorders>
               <w:top w:val="single" w:sz="2" w:space="0" w:color="CCCCCC"/>
               <w:start w:val="single" w:sz="2" w:space="0" w:color="CCCCCC"/>
@@ -8127,7 +8119,7 @@
         </w:tc>
         <w:tc>
           <w:tcPr>
-            <w:tcW w:w="1588" w:type="dxa"/>
+            <w:tcW w:w="1587" w:type="dxa"/>
             <w:tcBorders>
               <w:top w:val="single" w:sz="2" w:space="0" w:color="CCCCCC"/>
               <w:start w:val="single" w:sz="2" w:space="0" w:color="CCCCCC"/>
@@ -8162,7 +8154,7 @@
         </w:tc>
         <w:tc>
           <w:tcPr>
-            <w:tcW w:w="1998" w:type="dxa"/>
+            <w:tcW w:w="1999" w:type="dxa"/>
             <w:tcBorders>
               <w:top w:val="single" w:sz="2" w:space="0" w:color="CCCCCC"/>
               <w:start w:val="single" w:sz="2" w:space="0" w:color="CCCCCC"/>
@@ -8235,7 +8227,7 @@
         </w:tc>
         <w:tc>
           <w:tcPr>
-            <w:tcW w:w="1588" w:type="dxa"/>
+            <w:tcW w:w="1587" w:type="dxa"/>
             <w:tcBorders>
               <w:top w:val="single" w:sz="2" w:space="0" w:color="CCCCCC"/>
               <w:start w:val="single" w:sz="2" w:space="0" w:color="CCCCCC"/>
@@ -8270,7 +8262,7 @@
         </w:tc>
         <w:tc>
           <w:tcPr>
-            <w:tcW w:w="1589" w:type="dxa"/>
+            <w:tcW w:w="1590" w:type="dxa"/>
             <w:tcBorders>
               <w:top w:val="single" w:sz="2" w:space="0" w:color="CCCCCC"/>
               <w:start w:val="single" w:sz="2" w:space="0" w:color="CCCCCC"/>
@@ -8305,7 +8297,7 @@
         </w:tc>
         <w:tc>
           <w:tcPr>
-            <w:tcW w:w="1588" w:type="dxa"/>
+            <w:tcW w:w="1587" w:type="dxa"/>
             <w:tcBorders>
               <w:top w:val="single" w:sz="2" w:space="0" w:color="CCCCCC"/>
               <w:start w:val="single" w:sz="2" w:space="0" w:color="CCCCCC"/>
@@ -8340,7 +8332,7 @@
         </w:tc>
         <w:tc>
           <w:tcPr>
-            <w:tcW w:w="1998" w:type="dxa"/>
+            <w:tcW w:w="1999" w:type="dxa"/>
             <w:tcBorders>
               <w:top w:val="single" w:sz="2" w:space="0" w:color="CCCCCC"/>
               <w:start w:val="single" w:sz="2" w:space="0" w:color="CCCCCC"/>
@@ -8428,7 +8420,7 @@
       </w:pPr>
       <w:r>
         <w:rPr>
-          <w:rFonts w:eastAsia="Arial" w:cs="Arial" w:ascii="Arial" w:hAnsi="Arial"/>
+          <w:rFonts w:eastAsia="Arial" w:cs="Arial"/>
           <w:b/>
           <w:bCs/>
           <w:color w:val="1F3070"/>
@@ -8452,12 +8444,12 @@
         </w:tblCellMar>
       </w:tblPr>
       <w:tblGrid>
-        <w:gridCol w:w="3399"/>
-        <w:gridCol w:w="1001"/>
+        <w:gridCol w:w="3398"/>
+        <w:gridCol w:w="1002"/>
         <w:gridCol w:w="1240"/>
-        <w:gridCol w:w="1239"/>
+        <w:gridCol w:w="1238"/>
         <w:gridCol w:w="1240"/>
-        <w:gridCol w:w="1241"/>
+        <w:gridCol w:w="1242"/>
       </w:tblGrid>
       <w:tr>
         <w:trPr>
@@ -8465,7 +8457,7 @@
         </w:trPr>
         <w:tc>
           <w:tcPr>
-            <w:tcW w:w="3399" w:type="dxa"/>
+            <w:tcW w:w="3398" w:type="dxa"/>
             <w:tcBorders>
               <w:top w:val="single" w:sz="2" w:space="0" w:color="2E4099"/>
               <w:start w:val="single" w:sz="2" w:space="0" w:color="2E4099"/>
@@ -8495,7 +8487,7 @@
         </w:tc>
         <w:tc>
           <w:tcPr>
-            <w:tcW w:w="1001" w:type="dxa"/>
+            <w:tcW w:w="1002" w:type="dxa"/>
             <w:tcBorders>
               <w:top w:val="single" w:sz="2" w:space="0" w:color="2E4099"/>
               <w:start w:val="single" w:sz="2" w:space="0" w:color="2E4099"/>
@@ -8555,7 +8547,7 @@
         </w:tc>
         <w:tc>
           <w:tcPr>
-            <w:tcW w:w="1239" w:type="dxa"/>
+            <w:tcW w:w="1238" w:type="dxa"/>
             <w:tcBorders>
               <w:top w:val="single" w:sz="2" w:space="0" w:color="2E4099"/>
               <w:start w:val="single" w:sz="2" w:space="0" w:color="2E4099"/>
@@ -8615,7 +8607,7 @@
         </w:tc>
         <w:tc>
           <w:tcPr>
-            <w:tcW w:w="1241" w:type="dxa"/>
+            <w:tcW w:w="1242" w:type="dxa"/>
             <w:tcBorders>
               <w:top w:val="single" w:sz="2" w:space="0" w:color="2E4099"/>
               <w:start w:val="single" w:sz="2" w:space="0" w:color="2E4099"/>
@@ -8648,7 +8640,7 @@
         <w:trPr/>
         <w:tc>
           <w:tcPr>
-            <w:tcW w:w="3399" w:type="dxa"/>
+            <w:tcW w:w="3398" w:type="dxa"/>
             <w:tcBorders>
               <w:top w:val="single" w:sz="2" w:space="0" w:color="CCCCCC"/>
               <w:start w:val="single" w:sz="2" w:space="0" w:color="CCCCCC"/>
@@ -8683,7 +8675,7 @@
         </w:tc>
         <w:tc>
           <w:tcPr>
-            <w:tcW w:w="1001" w:type="dxa"/>
+            <w:tcW w:w="1002" w:type="dxa"/>
             <w:tcBorders>
               <w:top w:val="single" w:sz="2" w:space="0" w:color="CCCCCC"/>
               <w:start w:val="single" w:sz="2" w:space="0" w:color="CCCCCC"/>
@@ -8753,7 +8745,7 @@
         </w:tc>
         <w:tc>
           <w:tcPr>
-            <w:tcW w:w="1239" w:type="dxa"/>
+            <w:tcW w:w="1238" w:type="dxa"/>
             <w:tcBorders>
               <w:top w:val="single" w:sz="2" w:space="0" w:color="CCCCCC"/>
               <w:start w:val="single" w:sz="2" w:space="0" w:color="CCCCCC"/>
@@ -8823,7 +8815,7 @@
         </w:tc>
         <w:tc>
           <w:tcPr>
-            <w:tcW w:w="1241" w:type="dxa"/>
+            <w:tcW w:w="1242" w:type="dxa"/>
             <w:tcBorders>
               <w:top w:val="single" w:sz="2" w:space="0" w:color="CCCCCC"/>
               <w:start w:val="single" w:sz="2" w:space="0" w:color="CCCCCC"/>
@@ -8861,7 +8853,7 @@
         <w:trPr/>
         <w:tc>
           <w:tcPr>
-            <w:tcW w:w="3399" w:type="dxa"/>
+            <w:tcW w:w="3398" w:type="dxa"/>
             <w:tcBorders>
               <w:top w:val="single" w:sz="2" w:space="0" w:color="CCCCCC"/>
               <w:start w:val="single" w:sz="2" w:space="0" w:color="CCCCCC"/>
@@ -8896,7 +8888,7 @@
         </w:tc>
         <w:tc>
           <w:tcPr>
-            <w:tcW w:w="1001" w:type="dxa"/>
+            <w:tcW w:w="1002" w:type="dxa"/>
             <w:tcBorders>
               <w:top w:val="single" w:sz="2" w:space="0" w:color="CCCCCC"/>
               <w:start w:val="single" w:sz="2" w:space="0" w:color="CCCCCC"/>
@@ -8966,7 +8958,7 @@
         </w:tc>
         <w:tc>
           <w:tcPr>
-            <w:tcW w:w="1239" w:type="dxa"/>
+            <w:tcW w:w="1238" w:type="dxa"/>
             <w:tcBorders>
               <w:top w:val="single" w:sz="2" w:space="0" w:color="CCCCCC"/>
               <w:start w:val="single" w:sz="2" w:space="0" w:color="CCCCCC"/>
@@ -9036,7 +9028,7 @@
         </w:tc>
         <w:tc>
           <w:tcPr>
-            <w:tcW w:w="1241" w:type="dxa"/>
+            <w:tcW w:w="1242" w:type="dxa"/>
             <w:tcBorders>
               <w:top w:val="single" w:sz="2" w:space="0" w:color="CCCCCC"/>
               <w:start w:val="single" w:sz="2" w:space="0" w:color="CCCCCC"/>
@@ -9074,7 +9066,7 @@
         <w:trPr/>
         <w:tc>
           <w:tcPr>
-            <w:tcW w:w="3399" w:type="dxa"/>
+            <w:tcW w:w="3398" w:type="dxa"/>
             <w:tcBorders>
               <w:top w:val="single" w:sz="2" w:space="0" w:color="CCCCCC"/>
               <w:start w:val="single" w:sz="2" w:space="0" w:color="CCCCCC"/>
@@ -9109,7 +9101,7 @@
         </w:tc>
         <w:tc>
           <w:tcPr>
-            <w:tcW w:w="1001" w:type="dxa"/>
+            <w:tcW w:w="1002" w:type="dxa"/>
             <w:tcBorders>
               <w:top w:val="single" w:sz="2" w:space="0" w:color="CCCCCC"/>
               <w:start w:val="single" w:sz="2" w:space="0" w:color="CCCCCC"/>
@@ -9179,7 +9171,7 @@
         </w:tc>
         <w:tc>
           <w:tcPr>
-            <w:tcW w:w="1239" w:type="dxa"/>
+            <w:tcW w:w="1238" w:type="dxa"/>
             <w:tcBorders>
               <w:top w:val="single" w:sz="2" w:space="0" w:color="CCCCCC"/>
               <w:start w:val="single" w:sz="2" w:space="0" w:color="CCCCCC"/>
@@ -9249,7 +9241,7 @@
         </w:tc>
         <w:tc>
           <w:tcPr>
-            <w:tcW w:w="1241" w:type="dxa"/>
+            <w:tcW w:w="1242" w:type="dxa"/>
             <w:tcBorders>
               <w:top w:val="single" w:sz="2" w:space="0" w:color="CCCCCC"/>
               <w:start w:val="single" w:sz="2" w:space="0" w:color="CCCCCC"/>
@@ -9287,7 +9279,7 @@
         <w:trPr/>
         <w:tc>
           <w:tcPr>
-            <w:tcW w:w="3399" w:type="dxa"/>
+            <w:tcW w:w="3398" w:type="dxa"/>
             <w:tcBorders>
               <w:top w:val="single" w:sz="2" w:space="0" w:color="CCCCCC"/>
               <w:start w:val="single" w:sz="2" w:space="0" w:color="CCCCCC"/>
@@ -9322,7 +9314,7 @@
         </w:tc>
         <w:tc>
           <w:tcPr>
-            <w:tcW w:w="1001" w:type="dxa"/>
+            <w:tcW w:w="1002" w:type="dxa"/>
             <w:tcBorders>
               <w:top w:val="single" w:sz="2" w:space="0" w:color="CCCCCC"/>
               <w:start w:val="single" w:sz="2" w:space="0" w:color="CCCCCC"/>
@@ -9392,7 +9384,7 @@
         </w:tc>
         <w:tc>
           <w:tcPr>
-            <w:tcW w:w="1239" w:type="dxa"/>
+            <w:tcW w:w="1238" w:type="dxa"/>
             <w:tcBorders>
               <w:top w:val="single" w:sz="2" w:space="0" w:color="CCCCCC"/>
               <w:start w:val="single" w:sz="2" w:space="0" w:color="CCCCCC"/>
@@ -9462,7 +9454,7 @@
         </w:tc>
         <w:tc>
           <w:tcPr>
-            <w:tcW w:w="1241" w:type="dxa"/>
+            <w:tcW w:w="1242" w:type="dxa"/>
             <w:tcBorders>
               <w:top w:val="single" w:sz="2" w:space="0" w:color="CCCCCC"/>
               <w:start w:val="single" w:sz="2" w:space="0" w:color="CCCCCC"/>
@@ -9500,7 +9492,7 @@
         <w:trPr/>
         <w:tc>
           <w:tcPr>
-            <w:tcW w:w="3399" w:type="dxa"/>
+            <w:tcW w:w="3398" w:type="dxa"/>
             <w:tcBorders>
               <w:top w:val="single" w:sz="2" w:space="0" w:color="CCCCCC"/>
               <w:start w:val="single" w:sz="2" w:space="0" w:color="CCCCCC"/>
@@ -9535,7 +9527,7 @@
         </w:tc>
         <w:tc>
           <w:tcPr>
-            <w:tcW w:w="1001" w:type="dxa"/>
+            <w:tcW w:w="1002" w:type="dxa"/>
             <w:tcBorders>
               <w:top w:val="single" w:sz="2" w:space="0" w:color="CCCCCC"/>
               <w:start w:val="single" w:sz="2" w:space="0" w:color="CCCCCC"/>
@@ -9605,7 +9597,7 @@
         </w:tc>
         <w:tc>
           <w:tcPr>
-            <w:tcW w:w="1239" w:type="dxa"/>
+            <w:tcW w:w="1238" w:type="dxa"/>
             <w:tcBorders>
               <w:top w:val="single" w:sz="2" w:space="0" w:color="CCCCCC"/>
               <w:start w:val="single" w:sz="2" w:space="0" w:color="CCCCCC"/>
@@ -9675,7 +9667,7 @@
         </w:tc>
         <w:tc>
           <w:tcPr>
-            <w:tcW w:w="1241" w:type="dxa"/>
+            <w:tcW w:w="1242" w:type="dxa"/>
             <w:tcBorders>
               <w:top w:val="single" w:sz="2" w:space="0" w:color="CCCCCC"/>
               <w:start w:val="single" w:sz="2" w:space="0" w:color="CCCCCC"/>
@@ -9737,7 +9729,7 @@
       </w:pPr>
       <w:r>
         <w:rPr>
-          <w:rFonts w:eastAsia="Arial" w:cs="Arial" w:ascii="Arial" w:hAnsi="Arial"/>
+          <w:rFonts w:eastAsia="Arial" w:cs="Arial"/>
           <w:b/>
           <w:bCs/>
           <w:color w:val="1F3070"/>
@@ -9762,8 +9754,8 @@
       </w:tblPr>
       <w:tblGrid>
         <w:gridCol w:w="3200"/>
-        <w:gridCol w:w="3079"/>
-        <w:gridCol w:w="3081"/>
+        <w:gridCol w:w="3078"/>
+        <w:gridCol w:w="3082"/>
       </w:tblGrid>
       <w:tr>
         <w:trPr>
@@ -9801,7 +9793,7 @@
         </w:tc>
         <w:tc>
           <w:tcPr>
-            <w:tcW w:w="3079" w:type="dxa"/>
+            <w:tcW w:w="3078" w:type="dxa"/>
             <w:tcBorders>
               <w:top w:val="single" w:sz="2" w:space="0" w:color="2E4099"/>
               <w:start w:val="single" w:sz="2" w:space="0" w:color="2E4099"/>
@@ -9831,7 +9823,7 @@
         </w:tc>
         <w:tc>
           <w:tcPr>
-            <w:tcW w:w="3081" w:type="dxa"/>
+            <w:tcW w:w="3082" w:type="dxa"/>
             <w:tcBorders>
               <w:top w:val="single" w:sz="2" w:space="0" w:color="2E4099"/>
               <w:start w:val="single" w:sz="2" w:space="0" w:color="2E4099"/>
@@ -9899,7 +9891,7 @@
         </w:tc>
         <w:tc>
           <w:tcPr>
-            <w:tcW w:w="3079" w:type="dxa"/>
+            <w:tcW w:w="3078" w:type="dxa"/>
             <w:tcBorders>
               <w:top w:val="single" w:sz="2" w:space="0" w:color="CCCCCC"/>
               <w:start w:val="single" w:sz="2" w:space="0" w:color="CCCCCC"/>
@@ -9934,7 +9926,7 @@
         </w:tc>
         <w:tc>
           <w:tcPr>
-            <w:tcW w:w="3081" w:type="dxa"/>
+            <w:tcW w:w="3082" w:type="dxa"/>
             <w:tcBorders>
               <w:top w:val="single" w:sz="2" w:space="0" w:color="CCCCCC"/>
               <w:start w:val="single" w:sz="2" w:space="0" w:color="CCCCCC"/>
@@ -10007,7 +9999,7 @@
         </w:tc>
         <w:tc>
           <w:tcPr>
-            <w:tcW w:w="3079" w:type="dxa"/>
+            <w:tcW w:w="3078" w:type="dxa"/>
             <w:tcBorders>
               <w:top w:val="single" w:sz="2" w:space="0" w:color="CCCCCC"/>
               <w:start w:val="single" w:sz="2" w:space="0" w:color="CCCCCC"/>
@@ -10042,7 +10034,7 @@
         </w:tc>
         <w:tc>
           <w:tcPr>
-            <w:tcW w:w="3081" w:type="dxa"/>
+            <w:tcW w:w="3082" w:type="dxa"/>
             <w:tcBorders>
               <w:top w:val="single" w:sz="2" w:space="0" w:color="CCCCCC"/>
               <w:start w:val="single" w:sz="2" w:space="0" w:color="CCCCCC"/>
@@ -10104,7 +10096,7 @@
       </w:pPr>
       <w:r>
         <w:rPr>
-          <w:rFonts w:eastAsia="Arial" w:cs="Arial" w:ascii="Arial" w:hAnsi="Arial"/>
+          <w:rFonts w:eastAsia="Arial" w:cs="Arial"/>
           <w:b/>
           <w:bCs/>
           <w:color w:val="1F3070"/>
@@ -10138,7 +10130,7 @@
       </w:pPr>
       <w:r>
         <w:rPr>
-          <w:rFonts w:eastAsia="Arial" w:cs="Arial" w:ascii="Arial" w:hAnsi="Arial"/>
+          <w:rFonts w:eastAsia="Arial" w:cs="Arial"/>
           <w:b/>
           <w:bCs/>
           <w:color w:val="1F3070"/>
@@ -10298,7 +10290,7 @@
       </w:pPr>
       <w:r>
         <w:rPr>
-          <w:rFonts w:eastAsia="Arial" w:cs="Arial" w:ascii="Arial" w:hAnsi="Arial"/>
+          <w:rFonts w:eastAsia="Arial" w:cs="Arial"/>
           <w:b/>
           <w:bCs/>
           <w:color w:val="2E4099"/>
@@ -10439,6 +10431,7 @@
     <w:qFormat/>
     <w:pPr>
       <w:widowControl/>
+      <w:suppressAutoHyphens w:val="true"/>
       <w:bidi w:val="0"/>
       <w:spacing w:before="0" w:after="0"/>
       <w:jc w:val="start"/>
@@ -10535,11 +10528,18 @@
       <w:u w:val="single"/>
     </w:rPr>
   </w:style>
-  <w:style w:type="character" w:styleId="FootnoteCharacters">
-    <w:name w:val="Footnote Characters"/>
+  <w:style w:type="character" w:styleId="FootnoteCharactersuser">
+    <w:name w:val="Footnote Characters (user)"/>
     <w:uiPriority w:val="99"/>
     <w:semiHidden/>
     <w:unhideWhenUsed/>
+    <w:qFormat/>
+    <w:rPr>
+      <w:vertAlign w:val="superscript"/>
+    </w:rPr>
+  </w:style>
+  <w:style w:type="character" w:styleId="FootnoteCharacters">
+    <w:name w:val="Footnote Characters"/>
     <w:qFormat/>
     <w:rPr>
       <w:vertAlign w:val="superscript"/>
@@ -10563,11 +10563,18 @@
       <w:szCs w:val="20"/>
     </w:rPr>
   </w:style>
-  <w:style w:type="character" w:styleId="EndnoteCharacters">
-    <w:name w:val="Endnote Characters"/>
+  <w:style w:type="character" w:styleId="EndnoteCharactersuser">
+    <w:name w:val="Endnote Characters (user)"/>
     <w:uiPriority w:val="99"/>
     <w:semiHidden/>
     <w:unhideWhenUsed/>
+    <w:qFormat/>
+    <w:rPr>
+      <w:vertAlign w:val="superscript"/>
+    </w:rPr>
+  </w:style>
+  <w:style w:type="character" w:styleId="EndnoteCharacters">
+    <w:name w:val="Endnote Characters"/>
     <w:qFormat/>
     <w:rPr>
       <w:vertAlign w:val="superscript"/>
@@ -10664,6 +10671,7 @@
     <w:qFormat/>
     <w:pPr>
       <w:widowControl/>
+      <w:suppressAutoHyphens w:val="true"/>
       <w:bidi w:val="0"/>
       <w:spacing w:before="0" w:after="0"/>
       <w:jc w:val="start"/>
@@ -10684,6 +10692,7 @@
     <w:qFormat/>
     <w:pPr>
       <w:widowControl/>
+      <w:suppressAutoHyphens w:val="true"/>
       <w:bidi w:val="0"/>
       <w:spacing w:before="0" w:after="0"/>
       <w:jc w:val="start"/>

</xml_diff>